<commit_message>
build: refresh dist reading copies after P3 canonical fix
Regenerates dist/downloads + dist/manuscripts from current sources so the P3
reading copies reflect the canonical p3/ content (restored §3.4 Identification
& Endogeneity, 5 tables, hygiene-factor/depth-threshold §5.1 reframe, APJM).
Other papers/chapters re-emitted unchanged in substance.

https://claude.ai/code/session_01TNqoRFY1vAVQL6GWg8X9M3
</commit_message>
<xml_diff>
--- a/dist/downloads/manuscripts_en/p3_vietnam_en.docx
+++ b/dist/downloads/manuscripts_en/p3_vietnam_en.docx
@@ -86,7 +86,7 @@
           <w:iCs/>
           <w:i/>
         </w:rPr>
-        <w:t xml:space="preserve">Target journal: Journal of Asia Business Studies (JABS), Emerald Publishing</w:t>
+        <w:t xml:space="preserve">Target journal: Asia Pacific Journal of Management (APJM), Springer</w:t>
       </w:r>
     </w:p>
     <w:p>
@@ -17959,7 +17959,7 @@
         <w:pStyle w:val="BodyText"/>
       </w:pPr>
       <w:r>
-        <w:t xml:space="preserve">The negative sign on the FSTS_c × DAI_z interaction in 2023, where DAI productivity relevance attenuates at higher export intensities, is consistent with the Tier-1 boundary of the construct: a website alone cannot manage the transaction density of high-export-intensity operations without electronic-payment and process-integration support. This contrasts with settings where the same construct includes Tier 2 transaction-enabling items, where higher export intensity could instead amplify the productivity return to digital adoption.</w:t>
+        <w:t xml:space="preserve">The negative sign on the FSTS_c × DAI_z interaction in 2023, where DAI productivity relevance attenuates at higher export intensities, is consistent with the Tier-1 boundary of the construct: a website alone cannot manage the transaction density of high-export-intensity operations without electronic-payment and process-integration support. This contrasts with settings where the same construct includes Tier 2 transaction-enabling items, where higher export intensity could instead amplify the productivity return to digital adoption. Framed in capability terms, a Tier-1 website in transitional Vietnam operates as a saturated hygiene factor rather than a differentiating resource: with ownership approaching universality (42.5% in 2009 to 49.8% in 2023), it retains too little cross-firm variance to bend the export–performance curve, so the null is a substantive finding about a saturated threshold rather than a measurement shortfall. The contrast with a companion Singapore study, where the deeper Tier-1+2 construct amplifies the productivity return at high export intensity, indicates that foundational digital adoption is a context-dependent resource gated by a depth threshold: only past the shift from digitising information to integrating digital into processes does it acquire curve-reshaping potency, and only then can it act as a partial substitute for the institutional functions that remain underdeveloped in a transitional economy.</w:t>
       </w:r>
       <w:r>
         <w:t xml:space="preserve"> </w:t>

</xml_diff>